<commit_message>
refactor:Ajustes finales de frontend en identacion
</commit_message>
<xml_diff>
--- a/documents/SCV-Documentacion-Tecnica-Frontend.docx
+++ b/documents/SCV-Documentacion-Tecnica-Frontend.docx
@@ -87,7 +87,7 @@
         <w:pStyle w:val="Heading1"/>
         <w:spacing w:before="360" w:after="180"/>
       </w:pPr>
-      <w:bookmarkStart w:id="0" w:name="_Toc239726855"/>
+      <w:bookmarkStart w:id="0" w:name="_Toc239880795"/>
       <w:proofErr w:type="spellStart"/>
       <w:r>
         <w:lastRenderedPageBreak/>
@@ -126,7 +126,7 @@
           <w:r>
             <w:fldChar w:fldCharType="separate"/>
           </w:r>
-          <w:hyperlink w:anchor="_Toc239726855" w:history="1">
+          <w:hyperlink w:anchor="_Toc239880795" w:history="1">
             <w:r>
               <w:rPr>
                 <w:rStyle w:val="Hyperlink"/>
@@ -150,7 +150,7 @@
               <w:rPr>
                 <w:noProof/>
               </w:rPr>
-              <w:instrText xml:space="preserve"> PAGEREF _Toc239726855 \h </w:instrText>
+              <w:instrText xml:space="preserve"> PAGEREF _Toc239880795 \h </w:instrText>
             </w:r>
             <w:r>
               <w:rPr>
@@ -192,7 +192,7 @@
               <w14:ligatures w14:val="standardContextual"/>
             </w:rPr>
           </w:pPr>
-          <w:hyperlink w:anchor="_Toc239726856" w:history="1">
+          <w:hyperlink w:anchor="_Toc239880796" w:history="1">
             <w:r>
               <w:rPr>
                 <w:rStyle w:val="Hyperlink"/>
@@ -217,7 +217,7 @@
               <w:rPr>
                 <w:noProof/>
               </w:rPr>
-              <w:instrText xml:space="preserve"> PAGEREF _Toc239726856 \h </w:instrText>
+              <w:instrText xml:space="preserve"> PAGEREF _Toc239880796 \h </w:instrText>
             </w:r>
             <w:r>
               <w:rPr>
@@ -259,7 +259,7 @@
               <w14:ligatures w14:val="standardContextual"/>
             </w:rPr>
           </w:pPr>
-          <w:hyperlink w:anchor="_Toc239726857" w:history="1">
+          <w:hyperlink w:anchor="_Toc239880797" w:history="1">
             <w:r>
               <w:rPr>
                 <w:rStyle w:val="Hyperlink"/>
@@ -283,7 +283,7 @@
               <w:rPr>
                 <w:noProof/>
               </w:rPr>
-              <w:instrText xml:space="preserve"> PAGEREF _Toc239726857 \h </w:instrText>
+              <w:instrText xml:space="preserve"> PAGEREF _Toc239880797 \h </w:instrText>
             </w:r>
             <w:r>
               <w:rPr>
@@ -325,7 +325,7 @@
               <w14:ligatures w14:val="standardContextual"/>
             </w:rPr>
           </w:pPr>
-          <w:hyperlink w:anchor="_Toc239726858" w:history="1">
+          <w:hyperlink w:anchor="_Toc239880798" w:history="1">
             <w:r>
               <w:rPr>
                 <w:rStyle w:val="Hyperlink"/>
@@ -349,7 +349,7 @@
               <w:rPr>
                 <w:noProof/>
               </w:rPr>
-              <w:instrText xml:space="preserve"> PAGEREF _Toc239726858 \h </w:instrText>
+              <w:instrText xml:space="preserve"> PAGEREF _Toc239880798 \h </w:instrText>
             </w:r>
             <w:r>
               <w:rPr>
@@ -391,7 +391,7 @@
               <w14:ligatures w14:val="standardContextual"/>
             </w:rPr>
           </w:pPr>
-          <w:hyperlink w:anchor="_Toc239726859" w:history="1">
+          <w:hyperlink w:anchor="_Toc239880799" w:history="1">
             <w:r>
               <w:rPr>
                 <w:rStyle w:val="Hyperlink"/>
@@ -416,7 +416,7 @@
               <w:rPr>
                 <w:noProof/>
               </w:rPr>
-              <w:instrText xml:space="preserve"> PAGEREF _Toc239726859 \h </w:instrText>
+              <w:instrText xml:space="preserve"> PAGEREF _Toc239880799 \h </w:instrText>
             </w:r>
             <w:r>
               <w:rPr>
@@ -458,7 +458,7 @@
               <w14:ligatures w14:val="standardContextual"/>
             </w:rPr>
           </w:pPr>
-          <w:hyperlink w:anchor="_Toc239726860" w:history="1">
+          <w:hyperlink w:anchor="_Toc239880800" w:history="1">
             <w:r>
               <w:rPr>
                 <w:rStyle w:val="Hyperlink"/>
@@ -483,7 +483,7 @@
               <w:rPr>
                 <w:noProof/>
               </w:rPr>
-              <w:instrText xml:space="preserve"> PAGEREF _Toc239726860 \h </w:instrText>
+              <w:instrText xml:space="preserve"> PAGEREF _Toc239880800 \h </w:instrText>
             </w:r>
             <w:r>
               <w:rPr>
@@ -525,7 +525,7 @@
               <w14:ligatures w14:val="standardContextual"/>
             </w:rPr>
           </w:pPr>
-          <w:hyperlink w:anchor="_Toc239726861" w:history="1">
+          <w:hyperlink w:anchor="_Toc239880801" w:history="1">
             <w:r>
               <w:rPr>
                 <w:rStyle w:val="Hyperlink"/>
@@ -550,7 +550,7 @@
               <w:rPr>
                 <w:noProof/>
               </w:rPr>
-              <w:instrText xml:space="preserve"> PAGEREF _Toc239726861 \h </w:instrText>
+              <w:instrText xml:space="preserve"> PAGEREF _Toc239880801 \h </w:instrText>
             </w:r>
             <w:r>
               <w:rPr>
@@ -592,7 +592,7 @@
               <w14:ligatures w14:val="standardContextual"/>
             </w:rPr>
           </w:pPr>
-          <w:hyperlink w:anchor="_Toc239726862" w:history="1">
+          <w:hyperlink w:anchor="_Toc239880802" w:history="1">
             <w:r>
               <w:rPr>
                 <w:rStyle w:val="Hyperlink"/>
@@ -616,7 +616,7 @@
               <w:rPr>
                 <w:noProof/>
               </w:rPr>
-              <w:instrText xml:space="preserve"> PAGEREF _Toc239726862 \h </w:instrText>
+              <w:instrText xml:space="preserve"> PAGEREF _Toc239880802 \h </w:instrText>
             </w:r>
             <w:r>
               <w:rPr>
@@ -658,7 +658,7 @@
               <w14:ligatures w14:val="standardContextual"/>
             </w:rPr>
           </w:pPr>
-          <w:hyperlink w:anchor="_Toc239726863" w:history="1">
+          <w:hyperlink w:anchor="_Toc239880803" w:history="1">
             <w:r>
               <w:rPr>
                 <w:rStyle w:val="Hyperlink"/>
@@ -683,7 +683,7 @@
               <w:rPr>
                 <w:noProof/>
               </w:rPr>
-              <w:instrText xml:space="preserve"> PAGEREF _Toc239726863 \h </w:instrText>
+              <w:instrText xml:space="preserve"> PAGEREF _Toc239880803 \h </w:instrText>
             </w:r>
             <w:r>
               <w:rPr>
@@ -725,7 +725,7 @@
               <w14:ligatures w14:val="standardContextual"/>
             </w:rPr>
           </w:pPr>
-          <w:hyperlink w:anchor="_Toc239726864" w:history="1">
+          <w:hyperlink w:anchor="_Toc239880804" w:history="1">
             <w:r>
               <w:rPr>
                 <w:rStyle w:val="Hyperlink"/>
@@ -750,7 +750,7 @@
               <w:rPr>
                 <w:noProof/>
               </w:rPr>
-              <w:instrText xml:space="preserve"> PAGEREF _Toc239726864 \h </w:instrText>
+              <w:instrText xml:space="preserve"> PAGEREF _Toc239880804 \h </w:instrText>
             </w:r>
             <w:r>
               <w:rPr>
@@ -792,7 +792,7 @@
               <w14:ligatures w14:val="standardContextual"/>
             </w:rPr>
           </w:pPr>
-          <w:hyperlink w:anchor="_Toc239726865" w:history="1">
+          <w:hyperlink w:anchor="_Toc239880805" w:history="1">
             <w:r>
               <w:rPr>
                 <w:rStyle w:val="Hyperlink"/>
@@ -816,7 +816,7 @@
               <w:rPr>
                 <w:noProof/>
               </w:rPr>
-              <w:instrText xml:space="preserve"> PAGEREF _Toc239726865 \h </w:instrText>
+              <w:instrText xml:space="preserve"> PAGEREF _Toc239880805 \h </w:instrText>
             </w:r>
             <w:r>
               <w:rPr>
@@ -858,7 +858,7 @@
               <w14:ligatures w14:val="standardContextual"/>
             </w:rPr>
           </w:pPr>
-          <w:hyperlink w:anchor="_Toc239726866" w:history="1">
+          <w:hyperlink w:anchor="_Toc239880806" w:history="1">
             <w:r>
               <w:rPr>
                 <w:rStyle w:val="Hyperlink"/>
@@ -883,7 +883,7 @@
               <w:rPr>
                 <w:noProof/>
               </w:rPr>
-              <w:instrText xml:space="preserve"> PAGEREF _Toc239726866 \h </w:instrText>
+              <w:instrText xml:space="preserve"> PAGEREF _Toc239880806 \h </w:instrText>
             </w:r>
             <w:r>
               <w:rPr>
@@ -925,7 +925,7 @@
               <w14:ligatures w14:val="standardContextual"/>
             </w:rPr>
           </w:pPr>
-          <w:hyperlink w:anchor="_Toc239726867" w:history="1">
+          <w:hyperlink w:anchor="_Toc239880807" w:history="1">
             <w:r>
               <w:rPr>
                 <w:rStyle w:val="Hyperlink"/>
@@ -950,7 +950,7 @@
               <w:rPr>
                 <w:noProof/>
               </w:rPr>
-              <w:instrText xml:space="preserve"> PAGEREF _Toc239726867 \h </w:instrText>
+              <w:instrText xml:space="preserve"> PAGEREF _Toc239880807 \h </w:instrText>
             </w:r>
             <w:r>
               <w:rPr>
@@ -992,7 +992,7 @@
               <w14:ligatures w14:val="standardContextual"/>
             </w:rPr>
           </w:pPr>
-          <w:hyperlink w:anchor="_Toc239726868" w:history="1">
+          <w:hyperlink w:anchor="_Toc239880808" w:history="1">
             <w:r>
               <w:rPr>
                 <w:rStyle w:val="Hyperlink"/>
@@ -1016,7 +1016,7 @@
               <w:rPr>
                 <w:noProof/>
               </w:rPr>
-              <w:instrText xml:space="preserve"> PAGEREF _Toc239726868 \h </w:instrText>
+              <w:instrText xml:space="preserve"> PAGEREF _Toc239880808 \h </w:instrText>
             </w:r>
             <w:r>
               <w:rPr>
@@ -1058,7 +1058,7 @@
               <w14:ligatures w14:val="standardContextual"/>
             </w:rPr>
           </w:pPr>
-          <w:hyperlink w:anchor="_Toc239726869" w:history="1">
+          <w:hyperlink w:anchor="_Toc239880809" w:history="1">
             <w:r>
               <w:rPr>
                 <w:rStyle w:val="Hyperlink"/>
@@ -1082,7 +1082,7 @@
               <w:rPr>
                 <w:noProof/>
               </w:rPr>
-              <w:instrText xml:space="preserve"> PAGEREF _Toc239726869 \h </w:instrText>
+              <w:instrText xml:space="preserve"> PAGEREF _Toc239880809 \h </w:instrText>
             </w:r>
             <w:r>
               <w:rPr>
@@ -1124,7 +1124,7 @@
               <w14:ligatures w14:val="standardContextual"/>
             </w:rPr>
           </w:pPr>
-          <w:hyperlink w:anchor="_Toc239726870" w:history="1">
+          <w:hyperlink w:anchor="_Toc239880810" w:history="1">
             <w:r>
               <w:rPr>
                 <w:rStyle w:val="Hyperlink"/>
@@ -1149,7 +1149,7 @@
               <w:rPr>
                 <w:noProof/>
               </w:rPr>
-              <w:instrText xml:space="preserve"> PAGEREF _Toc239726870 \h </w:instrText>
+              <w:instrText xml:space="preserve"> PAGEREF _Toc239880810 \h </w:instrText>
             </w:r>
             <w:r>
               <w:rPr>
@@ -1191,7 +1191,7 @@
               <w14:ligatures w14:val="standardContextual"/>
             </w:rPr>
           </w:pPr>
-          <w:hyperlink w:anchor="_Toc239726871" w:history="1">
+          <w:hyperlink w:anchor="_Toc239880811" w:history="1">
             <w:r>
               <w:rPr>
                 <w:rStyle w:val="Hyperlink"/>
@@ -1215,7 +1215,7 @@
               <w:rPr>
                 <w:noProof/>
               </w:rPr>
-              <w:instrText xml:space="preserve"> PAGEREF _Toc239726871 \h </w:instrText>
+              <w:instrText xml:space="preserve"> PAGEREF _Toc239880811 \h </w:instrText>
             </w:r>
             <w:r>
               <w:rPr>
@@ -1257,7 +1257,7 @@
               <w14:ligatures w14:val="standardContextual"/>
             </w:rPr>
           </w:pPr>
-          <w:hyperlink w:anchor="_Toc239726872" w:history="1">
+          <w:hyperlink w:anchor="_Toc239880812" w:history="1">
             <w:r>
               <w:rPr>
                 <w:rStyle w:val="Hyperlink"/>
@@ -1282,7 +1282,7 @@
               <w:rPr>
                 <w:noProof/>
               </w:rPr>
-              <w:instrText xml:space="preserve"> PAGEREF _Toc239726872 \h </w:instrText>
+              <w:instrText xml:space="preserve"> PAGEREF _Toc239880812 \h </w:instrText>
             </w:r>
             <w:r>
               <w:rPr>
@@ -1324,7 +1324,7 @@
               <w14:ligatures w14:val="standardContextual"/>
             </w:rPr>
           </w:pPr>
-          <w:hyperlink w:anchor="_Toc239726873" w:history="1">
+          <w:hyperlink w:anchor="_Toc239880813" w:history="1">
             <w:r>
               <w:rPr>
                 <w:rStyle w:val="Hyperlink"/>
@@ -1349,7 +1349,7 @@
               <w:rPr>
                 <w:noProof/>
               </w:rPr>
-              <w:instrText xml:space="preserve"> PAGEREF _Toc239726873 \h </w:instrText>
+              <w:instrText xml:space="preserve"> PAGEREF _Toc239880813 \h </w:instrText>
             </w:r>
             <w:r>
               <w:rPr>
@@ -1391,7 +1391,7 @@
               <w14:ligatures w14:val="standardContextual"/>
             </w:rPr>
           </w:pPr>
-          <w:hyperlink w:anchor="_Toc239726874" w:history="1">
+          <w:hyperlink w:anchor="_Toc239880814" w:history="1">
             <w:r>
               <w:rPr>
                 <w:rStyle w:val="Hyperlink"/>
@@ -1415,7 +1415,7 @@
               <w:rPr>
                 <w:noProof/>
               </w:rPr>
-              <w:instrText xml:space="preserve"> PAGEREF _Toc239726874 \h </w:instrText>
+              <w:instrText xml:space="preserve"> PAGEREF _Toc239880814 \h </w:instrText>
             </w:r>
             <w:r>
               <w:rPr>
@@ -1457,7 +1457,7 @@
               <w14:ligatures w14:val="standardContextual"/>
             </w:rPr>
           </w:pPr>
-          <w:hyperlink w:anchor="_Toc239726875" w:history="1">
+          <w:hyperlink w:anchor="_Toc239880815" w:history="1">
             <w:r>
               <w:rPr>
                 <w:rStyle w:val="Hyperlink"/>
@@ -1482,7 +1482,7 @@
               <w:rPr>
                 <w:noProof/>
               </w:rPr>
-              <w:instrText xml:space="preserve"> PAGEREF _Toc239726875 \h </w:instrText>
+              <w:instrText xml:space="preserve"> PAGEREF _Toc239880815 \h </w:instrText>
             </w:r>
             <w:r>
               <w:rPr>
@@ -1524,7 +1524,7 @@
               <w14:ligatures w14:val="standardContextual"/>
             </w:rPr>
           </w:pPr>
-          <w:hyperlink w:anchor="_Toc239726876" w:history="1">
+          <w:hyperlink w:anchor="_Toc239880816" w:history="1">
             <w:r>
               <w:rPr>
                 <w:rStyle w:val="Hyperlink"/>
@@ -1548,7 +1548,7 @@
               <w:rPr>
                 <w:noProof/>
               </w:rPr>
-              <w:instrText xml:space="preserve"> PAGEREF _Toc239726876 \h </w:instrText>
+              <w:instrText xml:space="preserve"> PAGEREF _Toc239880816 \h </w:instrText>
             </w:r>
             <w:r>
               <w:rPr>
@@ -1590,7 +1590,7 @@
               <w14:ligatures w14:val="standardContextual"/>
             </w:rPr>
           </w:pPr>
-          <w:hyperlink w:anchor="_Toc239726877" w:history="1">
+          <w:hyperlink w:anchor="_Toc239880817" w:history="1">
             <w:r>
               <w:rPr>
                 <w:rStyle w:val="Hyperlink"/>
@@ -1614,7 +1614,7 @@
               <w:rPr>
                 <w:noProof/>
               </w:rPr>
-              <w:instrText xml:space="preserve"> PAGEREF _Toc239726877 \h </w:instrText>
+              <w:instrText xml:space="preserve"> PAGEREF _Toc239880817 \h </w:instrText>
             </w:r>
             <w:r>
               <w:rPr>
@@ -1656,7 +1656,7 @@
               <w14:ligatures w14:val="standardContextual"/>
             </w:rPr>
           </w:pPr>
-          <w:hyperlink w:anchor="_Toc239726878" w:history="1">
+          <w:hyperlink w:anchor="_Toc239880818" w:history="1">
             <w:r>
               <w:rPr>
                 <w:rStyle w:val="Hyperlink"/>
@@ -1680,7 +1680,7 @@
               <w:rPr>
                 <w:noProof/>
               </w:rPr>
-              <w:instrText xml:space="preserve"> PAGEREF _Toc239726878 \h </w:instrText>
+              <w:instrText xml:space="preserve"> PAGEREF _Toc239880818 \h </w:instrText>
             </w:r>
             <w:r>
               <w:rPr>
@@ -1722,7 +1722,7 @@
               <w14:ligatures w14:val="standardContextual"/>
             </w:rPr>
           </w:pPr>
-          <w:hyperlink w:anchor="_Toc239726879" w:history="1">
+          <w:hyperlink w:anchor="_Toc239880819" w:history="1">
             <w:r>
               <w:rPr>
                 <w:rStyle w:val="Hyperlink"/>
@@ -1747,7 +1747,7 @@
               <w:rPr>
                 <w:noProof/>
               </w:rPr>
-              <w:instrText xml:space="preserve"> PAGEREF _Toc239726879 \h </w:instrText>
+              <w:instrText xml:space="preserve"> PAGEREF _Toc239880819 \h </w:instrText>
             </w:r>
             <w:r>
               <w:rPr>
@@ -1789,7 +1789,7 @@
               <w14:ligatures w14:val="standardContextual"/>
             </w:rPr>
           </w:pPr>
-          <w:hyperlink w:anchor="_Toc239726880" w:history="1">
+          <w:hyperlink w:anchor="_Toc239880820" w:history="1">
             <w:r>
               <w:rPr>
                 <w:rStyle w:val="Hyperlink"/>
@@ -1814,7 +1814,7 @@
               <w:rPr>
                 <w:noProof/>
               </w:rPr>
-              <w:instrText xml:space="preserve"> PAGEREF _Toc239726880 \h </w:instrText>
+              <w:instrText xml:space="preserve"> PAGEREF _Toc239880820 \h </w:instrText>
             </w:r>
             <w:r>
               <w:rPr>
@@ -1856,7 +1856,7 @@
               <w14:ligatures w14:val="standardContextual"/>
             </w:rPr>
           </w:pPr>
-          <w:hyperlink w:anchor="_Toc239726881" w:history="1">
+          <w:hyperlink w:anchor="_Toc239880821" w:history="1">
             <w:r>
               <w:rPr>
                 <w:rStyle w:val="Hyperlink"/>
@@ -1880,7 +1880,7 @@
               <w:rPr>
                 <w:noProof/>
               </w:rPr>
-              <w:instrText xml:space="preserve"> PAGEREF _Toc239726881 \h </w:instrText>
+              <w:instrText xml:space="preserve"> PAGEREF _Toc239880821 \h </w:instrText>
             </w:r>
             <w:r>
               <w:rPr>
@@ -1922,7 +1922,7 @@
               <w14:ligatures w14:val="standardContextual"/>
             </w:rPr>
           </w:pPr>
-          <w:hyperlink w:anchor="_Toc239726882" w:history="1">
+          <w:hyperlink w:anchor="_Toc239880822" w:history="1">
             <w:r>
               <w:rPr>
                 <w:rStyle w:val="Hyperlink"/>
@@ -1947,7 +1947,7 @@
               <w:rPr>
                 <w:noProof/>
               </w:rPr>
-              <w:instrText xml:space="preserve"> PAGEREF _Toc239726882 \h </w:instrText>
+              <w:instrText xml:space="preserve"> PAGEREF _Toc239880822 \h </w:instrText>
             </w:r>
             <w:r>
               <w:rPr>
@@ -1989,7 +1989,7 @@
               <w14:ligatures w14:val="standardContextual"/>
             </w:rPr>
           </w:pPr>
-          <w:hyperlink w:anchor="_Toc239726883" w:history="1">
+          <w:hyperlink w:anchor="_Toc239880823" w:history="1">
             <w:r>
               <w:rPr>
                 <w:rStyle w:val="Hyperlink"/>
@@ -2014,7 +2014,7 @@
               <w:rPr>
                 <w:noProof/>
               </w:rPr>
-              <w:instrText xml:space="preserve"> PAGEREF _Toc239726883 \h </w:instrText>
+              <w:instrText xml:space="preserve"> PAGEREF _Toc239880823 \h </w:instrText>
             </w:r>
             <w:r>
               <w:rPr>
@@ -2056,7 +2056,7 @@
               <w14:ligatures w14:val="standardContextual"/>
             </w:rPr>
           </w:pPr>
-          <w:hyperlink w:anchor="_Toc239726884" w:history="1">
+          <w:hyperlink w:anchor="_Toc239880824" w:history="1">
             <w:r>
               <w:rPr>
                 <w:rStyle w:val="Hyperlink"/>
@@ -2080,7 +2080,7 @@
               <w:rPr>
                 <w:noProof/>
               </w:rPr>
-              <w:instrText xml:space="preserve"> PAGEREF _Toc239726884 \h </w:instrText>
+              <w:instrText xml:space="preserve"> PAGEREF _Toc239880824 \h </w:instrText>
             </w:r>
             <w:r>
               <w:rPr>
@@ -2122,7 +2122,7 @@
               <w14:ligatures w14:val="standardContextual"/>
             </w:rPr>
           </w:pPr>
-          <w:hyperlink w:anchor="_Toc239726885" w:history="1">
+          <w:hyperlink w:anchor="_Toc239880825" w:history="1">
             <w:r>
               <w:rPr>
                 <w:rStyle w:val="Hyperlink"/>
@@ -2147,7 +2147,7 @@
               <w:rPr>
                 <w:noProof/>
               </w:rPr>
-              <w:instrText xml:space="preserve"> PAGEREF _Toc239726885 \h </w:instrText>
+              <w:instrText xml:space="preserve"> PAGEREF _Toc239880825 \h </w:instrText>
             </w:r>
             <w:r>
               <w:rPr>
@@ -2164,7 +2164,7 @@
               <w:rPr>
                 <w:noProof/>
               </w:rPr>
-              <w:t>15</w:t>
+              <w:t>16</w:t>
             </w:r>
             <w:r>
               <w:rPr>
@@ -2189,7 +2189,7 @@
               <w14:ligatures w14:val="standardContextual"/>
             </w:rPr>
           </w:pPr>
-          <w:hyperlink w:anchor="_Toc239726886" w:history="1">
+          <w:hyperlink w:anchor="_Toc239880826" w:history="1">
             <w:r>
               <w:rPr>
                 <w:rStyle w:val="Hyperlink"/>
@@ -2214,7 +2214,7 @@
               <w:rPr>
                 <w:noProof/>
               </w:rPr>
-              <w:instrText xml:space="preserve"> PAGEREF _Toc239726886 \h </w:instrText>
+              <w:instrText xml:space="preserve"> PAGEREF _Toc239880826 \h </w:instrText>
             </w:r>
             <w:r>
               <w:rPr>
@@ -2256,7 +2256,7 @@
               <w14:ligatures w14:val="standardContextual"/>
             </w:rPr>
           </w:pPr>
-          <w:hyperlink w:anchor="_Toc239726887" w:history="1">
+          <w:hyperlink w:anchor="_Toc239880827" w:history="1">
             <w:r>
               <w:rPr>
                 <w:rStyle w:val="Hyperlink"/>
@@ -2281,7 +2281,7 @@
               <w:rPr>
                 <w:noProof/>
               </w:rPr>
-              <w:instrText xml:space="preserve"> PAGEREF _Toc239726887 \h </w:instrText>
+              <w:instrText xml:space="preserve"> PAGEREF _Toc239880827 \h </w:instrText>
             </w:r>
             <w:r>
               <w:rPr>
@@ -2323,7 +2323,7 @@
               <w14:ligatures w14:val="standardContextual"/>
             </w:rPr>
           </w:pPr>
-          <w:hyperlink w:anchor="_Toc239726888" w:history="1">
+          <w:hyperlink w:anchor="_Toc239880828" w:history="1">
             <w:r>
               <w:rPr>
                 <w:rStyle w:val="Hyperlink"/>
@@ -2348,7 +2348,7 @@
               <w:rPr>
                 <w:noProof/>
               </w:rPr>
-              <w:instrText xml:space="preserve"> PAGEREF _Toc239726888 \h </w:instrText>
+              <w:instrText xml:space="preserve"> PAGEREF _Toc239880828 \h </w:instrText>
             </w:r>
             <w:r>
               <w:rPr>
@@ -2390,7 +2390,7 @@
               <w14:ligatures w14:val="standardContextual"/>
             </w:rPr>
           </w:pPr>
-          <w:hyperlink w:anchor="_Toc239726889" w:history="1">
+          <w:hyperlink w:anchor="_Toc239880829" w:history="1">
             <w:r>
               <w:rPr>
                 <w:rStyle w:val="Hyperlink"/>
@@ -2415,7 +2415,7 @@
               <w:rPr>
                 <w:noProof/>
               </w:rPr>
-              <w:instrText xml:space="preserve"> PAGEREF _Toc239726889 \h </w:instrText>
+              <w:instrText xml:space="preserve"> PAGEREF _Toc239880829 \h </w:instrText>
             </w:r>
             <w:r>
               <w:rPr>
@@ -2457,7 +2457,7 @@
               <w14:ligatures w14:val="standardContextual"/>
             </w:rPr>
           </w:pPr>
-          <w:hyperlink w:anchor="_Toc239726890" w:history="1">
+          <w:hyperlink w:anchor="_Toc239880830" w:history="1">
             <w:r>
               <w:rPr>
                 <w:rStyle w:val="Hyperlink"/>
@@ -2482,7 +2482,7 @@
               <w:rPr>
                 <w:noProof/>
               </w:rPr>
-              <w:instrText xml:space="preserve"> PAGEREF _Toc239726890 \h </w:instrText>
+              <w:instrText xml:space="preserve"> PAGEREF _Toc239880830 \h </w:instrText>
             </w:r>
             <w:r>
               <w:rPr>
@@ -2529,7 +2529,7 @@
           <w:lang w:val="es-BO"/>
         </w:rPr>
       </w:pPr>
-      <w:bookmarkStart w:id="1" w:name="_Toc239726856"/>
+      <w:bookmarkStart w:id="1" w:name="_Toc239880796"/>
       <w:r>
         <w:rPr>
           <w:lang w:val="es-BO"/>
@@ -2574,7 +2574,7 @@
         <w:pStyle w:val="Heading2"/>
         <w:spacing w:before="280" w:after="140"/>
       </w:pPr>
-      <w:bookmarkStart w:id="2" w:name="_Toc239726857"/>
+      <w:bookmarkStart w:id="2" w:name="_Toc239880797"/>
       <w:r>
         <w:t xml:space="preserve">1.1 </w:t>
       </w:r>
@@ -2758,7 +2758,7 @@
         <w:pStyle w:val="Heading1"/>
         <w:spacing w:before="360" w:after="180"/>
       </w:pPr>
-      <w:bookmarkStart w:id="3" w:name="_Toc239726858"/>
+      <w:bookmarkStart w:id="3" w:name="_Toc239880798"/>
       <w:r>
         <w:t xml:space="preserve">2. Stack </w:t>
       </w:r>
@@ -3538,7 +3538,7 @@
           <w:lang w:val="es-BO"/>
         </w:rPr>
       </w:pPr>
-      <w:bookmarkStart w:id="4" w:name="_Toc239726859"/>
+      <w:bookmarkStart w:id="4" w:name="_Toc239880799"/>
       <w:r>
         <w:rPr>
           <w:lang w:val="es-BO"/>
@@ -3628,7 +3628,7 @@
           <w:lang w:val="es-BO"/>
         </w:rPr>
       </w:pPr>
-      <w:bookmarkStart w:id="5" w:name="_Toc239726860"/>
+      <w:bookmarkStart w:id="5" w:name="_Toc239880800"/>
       <w:r>
         <w:rPr>
           <w:lang w:val="es-BO"/>
@@ -4083,7 +4083,7 @@
           <w:lang w:val="es-BO"/>
         </w:rPr>
       </w:pPr>
-      <w:bookmarkStart w:id="6" w:name="_Toc239726861"/>
+      <w:bookmarkStart w:id="6" w:name="_Toc239880801"/>
       <w:r>
         <w:rPr>
           <w:lang w:val="es-BO"/>
@@ -4614,7 +4614,7 @@
         <w:pStyle w:val="Heading1"/>
         <w:spacing w:before="360" w:after="180"/>
       </w:pPr>
-      <w:bookmarkStart w:id="7" w:name="_Toc239726862"/>
+      <w:bookmarkStart w:id="7" w:name="_Toc239880802"/>
       <w:r>
         <w:t xml:space="preserve">4. </w:t>
       </w:r>
@@ -5610,7 +5610,7 @@
           <w:lang w:val="es-BO"/>
         </w:rPr>
       </w:pPr>
-      <w:bookmarkStart w:id="8" w:name="_Toc239726863"/>
+      <w:bookmarkStart w:id="8" w:name="_Toc239880803"/>
       <w:r>
         <w:rPr>
           <w:lang w:val="es-BO"/>
@@ -6557,6 +6557,15 @@
           <w:lang w:val="es-BO"/>
         </w:rPr>
       </w:pPr>
+    </w:p>
+    <w:p>
+      <w:pPr>
+        <w:spacing w:after="140" w:line="300" w:lineRule="auto"/>
+        <w:jc w:val="both"/>
+        <w:rPr>
+          <w:lang w:val="es-BO"/>
+        </w:rPr>
+      </w:pPr>
       <w:r>
         <w:rPr>
           <w:lang w:val="es-BO"/>
@@ -6614,7 +6623,7 @@
           <w:lang w:val="es-BO"/>
         </w:rPr>
       </w:pPr>
-      <w:bookmarkStart w:id="9" w:name="_Toc239726864"/>
+      <w:bookmarkStart w:id="9" w:name="_Toc239880804"/>
       <w:r>
         <w:rPr>
           <w:lang w:val="es-BO"/>
@@ -7140,7 +7149,7 @@
         <w:pStyle w:val="Heading2"/>
         <w:spacing w:before="280" w:after="140"/>
       </w:pPr>
-      <w:bookmarkStart w:id="10" w:name="_Toc239726865"/>
+      <w:bookmarkStart w:id="10" w:name="_Toc239880805"/>
       <w:r>
         <w:t>6.1 Dominio trip</w:t>
       </w:r>
@@ -8614,7 +8623,7 @@
           <w:lang w:val="es-BO"/>
         </w:rPr>
       </w:pPr>
-      <w:bookmarkStart w:id="11" w:name="_Toc239726866"/>
+      <w:bookmarkStart w:id="11" w:name="_Toc239880806"/>
       <w:r>
         <w:rPr>
           <w:lang w:val="es-BO"/>
@@ -10745,7 +10754,7 @@
           <w:lang w:val="es-BO"/>
         </w:rPr>
       </w:pPr>
-      <w:bookmarkStart w:id="12" w:name="_Toc239726867"/>
+      <w:bookmarkStart w:id="12" w:name="_Toc239880807"/>
       <w:r>
         <w:rPr>
           <w:lang w:val="es-BO"/>
@@ -13455,7 +13464,7 @@
         <w:pStyle w:val="Heading2"/>
         <w:spacing w:before="280" w:after="140"/>
       </w:pPr>
-      <w:bookmarkStart w:id="13" w:name="_Toc239726868"/>
+      <w:bookmarkStart w:id="13" w:name="_Toc239880808"/>
       <w:r>
         <w:lastRenderedPageBreak/>
         <w:t>6.4 Dominio admin</w:t>
@@ -14437,6 +14446,15 @@
           <w:lang w:val="es-BO"/>
         </w:rPr>
       </w:pPr>
+    </w:p>
+    <w:p>
+      <w:pPr>
+        <w:spacing w:after="140" w:line="300" w:lineRule="auto"/>
+        <w:jc w:val="both"/>
+        <w:rPr>
+          <w:lang w:val="es-BO"/>
+        </w:rPr>
+      </w:pPr>
       <w:r>
         <w:rPr>
           <w:lang w:val="es-BO"/>
@@ -14491,7 +14509,7 @@
         <w:pStyle w:val="Heading2"/>
         <w:spacing w:before="280" w:after="140"/>
       </w:pPr>
-      <w:bookmarkStart w:id="14" w:name="_Toc239726869"/>
+      <w:bookmarkStart w:id="14" w:name="_Toc239880809"/>
       <w:r>
         <w:t>6.5 Dominio user</w:t>
       </w:r>
@@ -14767,7 +14785,7 @@
           <w:lang w:val="es-BO"/>
         </w:rPr>
       </w:pPr>
-      <w:bookmarkStart w:id="15" w:name="_Toc239726870"/>
+      <w:bookmarkStart w:id="15" w:name="_Toc239880810"/>
       <w:r>
         <w:rPr>
           <w:lang w:val="es-BO"/>
@@ -14824,7 +14842,7 @@
         <w:pStyle w:val="Heading2"/>
         <w:spacing w:before="280" w:after="140"/>
       </w:pPr>
-      <w:bookmarkStart w:id="16" w:name="_Toc239726871"/>
+      <w:bookmarkStart w:id="16" w:name="_Toc239880811"/>
       <w:r>
         <w:t xml:space="preserve">7.1 </w:t>
       </w:r>
@@ -15265,6 +15283,7 @@
                 <w:sz w:val="19"/>
                 <w:szCs w:val="19"/>
               </w:rPr>
+              <w:lastRenderedPageBreak/>
               <w:t>useUploadInvoice</w:t>
             </w:r>
             <w:proofErr w:type="spellEnd"/>
@@ -15342,7 +15361,6 @@
                 <w:sz w:val="19"/>
                 <w:szCs w:val="19"/>
               </w:rPr>
-              <w:lastRenderedPageBreak/>
               <w:t>useEditInvoice</w:t>
             </w:r>
             <w:proofErr w:type="spellEnd"/>
@@ -16680,7 +16698,7 @@
           <w:lang w:val="es-BO"/>
         </w:rPr>
       </w:pPr>
-      <w:bookmarkStart w:id="17" w:name="_Toc239726872"/>
+      <w:bookmarkStart w:id="17" w:name="_Toc239880812"/>
       <w:r>
         <w:rPr>
           <w:lang w:val="es-BO"/>
@@ -16755,7 +16773,7 @@
           <w:lang w:val="es-BO"/>
         </w:rPr>
       </w:pPr>
-      <w:bookmarkStart w:id="18" w:name="_Toc239726873"/>
+      <w:bookmarkStart w:id="18" w:name="_Toc239880813"/>
       <w:r>
         <w:rPr>
           <w:lang w:val="es-BO"/>
@@ -16804,7 +16822,14 @@
         <w:rPr>
           <w:lang w:val="es-BO"/>
         </w:rPr>
-        <w:t xml:space="preserve">, encapsula el verbo HTTP y la ruta, y normaliza la respuesta: los errores se devuelven como un objeto con la propiedad error en lugar de propagarse como excepciones, lo que simplifica su manejo en los </w:t>
+        <w:t xml:space="preserve">, encapsula el verbo HTTP y la ruta, y normaliza la respuesta: los errores se devuelven como un objeto con la propiedad error en lugar de </w:t>
+      </w:r>
+      <w:r>
+        <w:rPr>
+          <w:lang w:val="es-BO"/>
+        </w:rPr>
+        <w:lastRenderedPageBreak/>
+        <w:t xml:space="preserve">propagarse como excepciones, lo que simplifica su manejo en los </w:t>
       </w:r>
       <w:proofErr w:type="spellStart"/>
       <w:r>
@@ -16833,7 +16858,6 @@
           <w:sz w:val="16"/>
           <w:szCs w:val="16"/>
         </w:rPr>
-        <w:lastRenderedPageBreak/>
         <w:t xml:space="preserve">export const </w:t>
       </w:r>
       <w:proofErr w:type="spellStart"/>
@@ -17111,6 +17135,11 @@
         <w:shd w:val="clear" w:color="auto" w:fill="F5F7FA"/>
         <w:spacing w:after="160" w:line="230" w:lineRule="auto"/>
         <w:ind w:left="215"/>
+        <w:rPr>
+          <w:rFonts w:ascii="Consolas" w:eastAsia="Consolas" w:hAnsi="Consolas" w:cs="Consolas"/>
+          <w:sz w:val="16"/>
+          <w:szCs w:val="16"/>
+        </w:rPr>
       </w:pPr>
       <w:r>
         <w:rPr>
@@ -17120,6 +17149,16 @@
         </w:rPr>
         <w:t>};</w:t>
       </w:r>
+    </w:p>
+    <w:p>
+      <w:pPr>
+        <w:spacing w:after="160" w:line="230" w:lineRule="auto"/>
+        <w:rPr>
+          <w:rFonts w:ascii="Consolas" w:eastAsia="Consolas" w:hAnsi="Consolas" w:cs="Consolas"/>
+          <w:sz w:val="16"/>
+          <w:szCs w:val="16"/>
+        </w:rPr>
+      </w:pPr>
     </w:p>
     <w:tbl>
       <w:tblPr>
@@ -18139,7 +18178,7 @@
         <w:pStyle w:val="Heading1"/>
         <w:spacing w:before="360" w:after="180"/>
       </w:pPr>
-      <w:bookmarkStart w:id="19" w:name="_Toc239726874"/>
+      <w:bookmarkStart w:id="19" w:name="_Toc239880814"/>
       <w:r>
         <w:t xml:space="preserve">9. </w:t>
       </w:r>
@@ -18577,7 +18616,7 @@
           <w:lang w:val="es-BO"/>
         </w:rPr>
       </w:pPr>
-      <w:bookmarkStart w:id="20" w:name="_Toc239726875"/>
+      <w:bookmarkStart w:id="20" w:name="_Toc239880815"/>
       <w:r>
         <w:rPr>
           <w:lang w:val="es-BO"/>
@@ -18661,6 +18700,7 @@
                 <w:sz w:val="19"/>
                 <w:szCs w:val="19"/>
               </w:rPr>
+              <w:lastRenderedPageBreak/>
               <w:t>Función</w:t>
             </w:r>
             <w:proofErr w:type="spellEnd"/>
@@ -18902,7 +18942,6 @@
                 <w:sz w:val="19"/>
                 <w:szCs w:val="19"/>
               </w:rPr>
-              <w:lastRenderedPageBreak/>
               <w:t>registerExpensePath</w:t>
             </w:r>
             <w:proofErr w:type="spellEnd"/>
@@ -19840,7 +19879,7 @@
         <w:pStyle w:val="Heading2"/>
         <w:spacing w:before="280" w:after="140"/>
       </w:pPr>
-      <w:bookmarkStart w:id="21" w:name="_Toc239726876"/>
+      <w:bookmarkStart w:id="21" w:name="_Toc239880816"/>
       <w:r>
         <w:t xml:space="preserve">9.2 </w:t>
       </w:r>
@@ -20071,7 +20110,7 @@
         <w:pStyle w:val="Heading1"/>
         <w:spacing w:before="360" w:after="180"/>
       </w:pPr>
-      <w:bookmarkStart w:id="22" w:name="_Toc239726877"/>
+      <w:bookmarkStart w:id="22" w:name="_Toc239880817"/>
       <w:r>
         <w:t xml:space="preserve">10. </w:t>
       </w:r>
@@ -21142,6 +21181,7 @@
                 <w:sz w:val="19"/>
                 <w:szCs w:val="19"/>
               </w:rPr>
+              <w:lastRenderedPageBreak/>
               <w:t>ExpenseDetailPage</w:t>
             </w:r>
             <w:proofErr w:type="spellEnd"/>
@@ -21316,7 +21356,6 @@
                 <w:sz w:val="19"/>
                 <w:szCs w:val="19"/>
               </w:rPr>
-              <w:lastRenderedPageBreak/>
               <w:t>UserManagementPage</w:t>
             </w:r>
             <w:proofErr w:type="spellEnd"/>
@@ -22934,7 +22973,7 @@
         <w:pStyle w:val="Heading2"/>
         <w:spacing w:before="280" w:after="140"/>
       </w:pPr>
-      <w:bookmarkStart w:id="23" w:name="_Toc239726878"/>
+      <w:bookmarkStart w:id="23" w:name="_Toc239880818"/>
       <w:r>
         <w:t xml:space="preserve">10.1 </w:t>
       </w:r>
@@ -23078,7 +23117,7 @@
           <w:lang w:val="es-BO"/>
         </w:rPr>
       </w:pPr>
-      <w:bookmarkStart w:id="24" w:name="_Toc239726879"/>
+      <w:bookmarkStart w:id="24" w:name="_Toc239880819"/>
       <w:r>
         <w:rPr>
           <w:lang w:val="es-BO"/>
@@ -23232,6 +23271,7 @@
           <w:sz w:val="16"/>
           <w:szCs w:val="16"/>
         </w:rPr>
+        <w:lastRenderedPageBreak/>
         <w:t>else if (</w:t>
       </w:r>
       <w:proofErr w:type="spellStart"/>
@@ -23379,7 +23419,6 @@
           <w:sz w:val="16"/>
           <w:szCs w:val="16"/>
         </w:rPr>
-        <w:lastRenderedPageBreak/>
         <w:t>}</w:t>
       </w:r>
     </w:p>
@@ -23584,7 +23623,7 @@
           <w:lang w:val="es-BO"/>
         </w:rPr>
       </w:pPr>
-      <w:bookmarkStart w:id="25" w:name="_Toc239726880"/>
+      <w:bookmarkStart w:id="25" w:name="_Toc239880820"/>
       <w:r>
         <w:rPr>
           <w:lang w:val="es-BO"/>
@@ -23802,7 +23841,7 @@
         <w:pStyle w:val="Heading1"/>
         <w:spacing w:before="360" w:after="180"/>
       </w:pPr>
-      <w:bookmarkStart w:id="26" w:name="_Toc239726881"/>
+      <w:bookmarkStart w:id="26" w:name="_Toc239880821"/>
       <w:r>
         <w:t xml:space="preserve">12. </w:t>
       </w:r>
@@ -24186,7 +24225,7 @@
           <w:lang w:val="es-BO"/>
         </w:rPr>
       </w:pPr>
-      <w:bookmarkStart w:id="27" w:name="_Toc239726882"/>
+      <w:bookmarkStart w:id="27" w:name="_Toc239880822"/>
       <w:r>
         <w:rPr>
           <w:lang w:val="es-BO"/>
@@ -24270,6 +24309,7 @@
                 <w:sz w:val="19"/>
                 <w:szCs w:val="19"/>
               </w:rPr>
+              <w:lastRenderedPageBreak/>
               <w:t>Token</w:t>
             </w:r>
           </w:p>
@@ -24418,7 +24458,6 @@
                 <w:sz w:val="19"/>
                 <w:szCs w:val="19"/>
               </w:rPr>
-              <w:lastRenderedPageBreak/>
               <w:t>secondary</w:t>
             </w:r>
           </w:p>
@@ -25427,7 +25466,7 @@
           <w:lang w:val="es-BO"/>
         </w:rPr>
       </w:pPr>
-      <w:bookmarkStart w:id="28" w:name="_Toc239726883"/>
+      <w:bookmarkStart w:id="28" w:name="_Toc239880823"/>
       <w:r>
         <w:rPr>
           <w:lang w:val="es-BO"/>
@@ -25595,7 +25634,7 @@
         <w:pStyle w:val="Heading1"/>
         <w:spacing w:before="360" w:after="180"/>
       </w:pPr>
-      <w:bookmarkStart w:id="29" w:name="_Toc239726884"/>
+      <w:bookmarkStart w:id="29" w:name="_Toc239880824"/>
       <w:r>
         <w:t xml:space="preserve">14. </w:t>
       </w:r>
@@ -25913,6 +25952,15 @@
           <w:lang w:val="es-BO"/>
         </w:rPr>
       </w:pPr>
+    </w:p>
+    <w:p>
+      <w:pPr>
+        <w:spacing w:after="140" w:line="300" w:lineRule="auto"/>
+        <w:jc w:val="both"/>
+        <w:rPr>
+          <w:lang w:val="es-BO"/>
+        </w:rPr>
+      </w:pPr>
       <w:r>
         <w:rPr>
           <w:lang w:val="es-BO"/>
@@ -26107,11 +26155,12 @@
           <w:lang w:val="es-BO"/>
         </w:rPr>
       </w:pPr>
-      <w:bookmarkStart w:id="30" w:name="_Toc239726885"/>
-      <w:r>
-        <w:rPr>
-          <w:lang w:val="es-BO"/>
-        </w:rPr>
+      <w:bookmarkStart w:id="30" w:name="_Toc239880825"/>
+      <w:r>
+        <w:rPr>
+          <w:lang w:val="es-BO"/>
+        </w:rPr>
+        <w:lastRenderedPageBreak/>
         <w:t>15. Funcionalidades técnicas destacadas</w:t>
       </w:r>
       <w:bookmarkEnd w:id="30"/>
@@ -26124,12 +26173,11 @@
           <w:lang w:val="es-BO"/>
         </w:rPr>
       </w:pPr>
-      <w:bookmarkStart w:id="31" w:name="_Toc239726886"/>
-      <w:r>
-        <w:rPr>
-          <w:lang w:val="es-BO"/>
-        </w:rPr>
-        <w:lastRenderedPageBreak/>
+      <w:bookmarkStart w:id="31" w:name="_Toc239880826"/>
+      <w:r>
+        <w:rPr>
+          <w:lang w:val="es-BO"/>
+        </w:rPr>
         <w:t>15.1 Generación de la planilla de rendición</w:t>
       </w:r>
       <w:bookmarkEnd w:id="31"/>
@@ -26423,7 +26471,7 @@
           <w:lang w:val="es-BO"/>
         </w:rPr>
       </w:pPr>
-      <w:bookmarkStart w:id="32" w:name="_Toc239726887"/>
+      <w:bookmarkStart w:id="32" w:name="_Toc239880827"/>
       <w:r>
         <w:rPr>
           <w:lang w:val="es-BO"/>
@@ -26470,7 +26518,7 @@
           <w:lang w:val="es-BO"/>
         </w:rPr>
       </w:pPr>
-      <w:bookmarkStart w:id="33" w:name="_Toc239726888"/>
+      <w:bookmarkStart w:id="33" w:name="_Toc239880828"/>
       <w:r>
         <w:rPr>
           <w:lang w:val="es-BO"/>
@@ -26589,7 +26637,7 @@
           <w:lang w:val="es-BO"/>
         </w:rPr>
       </w:pPr>
-      <w:bookmarkStart w:id="34" w:name="_Toc239726889"/>
+      <w:bookmarkStart w:id="34" w:name="_Toc239880829"/>
       <w:r>
         <w:rPr>
           <w:lang w:val="es-BO"/>
@@ -26679,7 +26727,7 @@
           <w:lang w:val="es-BO"/>
         </w:rPr>
       </w:pPr>
-      <w:bookmarkStart w:id="35" w:name="_Toc239726890"/>
+      <w:bookmarkStart w:id="35" w:name="_Toc239880830"/>
       <w:r>
         <w:rPr>
           <w:lang w:val="es-BO"/>

</xml_diff>